<commit_message>
Agregar el link del repositorio al reporte del laboratorio
Co-Authored-By: Claude Opus 5 <noreply@anthropic.com>
</commit_message>
<xml_diff>
--- a/LABORATORIO #5– Diagramas de caja gris - Resuelto - Fer Guzman.docx
+++ b/LABORATORIO #5– Diagramas de caja gris - Resuelto - Fer Guzman.docx
@@ -218,6 +218,28 @@
         </w:tc>
       </w:tr>
     </w:tbl>
+    <w:p>
+      <w:pPr>
+        <w:spacing w:before="120" w:after="0" w:line="276" w:lineRule="auto"/>
+        <w:ind w:left="0"/>
+        <w:jc w:val="center"/>
+        <w:rPr>
+          <w:rFonts w:asciiTheme="minorHAnsi" w:hAnsiTheme="minorHAnsi" w:cstheme="minorHAnsi"/>
+          <w:sz w:val="22"/>
+          <w:szCs w:val="22"/>
+          <w:lang w:val="es-MX"/>
+        </w:rPr>
+      </w:pPr>
+      <w:r>
+        <w:rPr>
+          <w:rFonts w:asciiTheme="minorHAnsi" w:hAnsiTheme="minorHAnsi" w:cstheme="minorHAnsi"/>
+          <w:sz w:val="22"/>
+          <w:szCs w:val="22"/>
+          <w:lang w:val="es-MX"/>
+        </w:rPr>
+        <w:t xml:space="preserve">Repositorio: https://github.com/FerGuzman65/Lab5-Pruebas-de-software</w:t>
+      </w:r>
+    </w:p>
     <w:p>
       <w:pPr>
         <w:rPr>
@@ -4384,7 +4406,7 @@
           <w:szCs w:val="22"/>
           <w:lang w:val="es-MX"/>
         </w:rPr>
-        <w:t xml:space="preserve">Se incluye la evidencia de cada caso de prueba: el código con el que se diseñaron y la salida de la consola al ejecutarlos con pytest.</w:t>
+        <w:t xml:space="preserve">Se incluye la evidencia de cada caso de prueba: el código con el que se diseñaron y la salida de la consola al ejecutarlos con pytest. Los commits de cada caso están en el repositorio indicado en la primera página.</w:t>
       </w:r>
     </w:p>
     <w:p>

</xml_diff>